<commit_message>
Identidade bege: cabeçalho e rodapé do site no bege, logotipo e modelo de peça no bege com dourado #7A5D10
- Site: cabeçalho, menu do celular e rodapé no bege #F3EEE6, com logotipo em dourado #7A5D10 e theme-color bege.
- Logotipos bege (quadrado e horizontal) gerados por scripts/gerar-logotipos.mjs.
- Modelo de peça com faixas bege; rodapé todo bege, colado na borda e com o texto centralizado,
  com as faixas presas ao cabeçalho para o Google Docs não deslocá-las.

Co-Authored-By: Claude Opus 5.5 <noreply@anthropic.com>
</commit_message>
<xml_diff>
--- a/identidade/modelo-peticao-figueiredo-lima.docx
+++ b/identidade/modelo-peticao-figueiredo-lima.docx
@@ -866,7 +866,7 @@
       <w:headerReference w:type="default" r:id="rId7"/>
       <w:footerReference w:type="default" r:id="rId8"/>
       <w:pgSz w:w="11906" w:h="16838" w:orient="portrait"/>
-      <w:pgMar w:top="1701" w:right="1134" w:bottom="1361" w:left="1701" w:header="567" w:footer="340" w:gutter="0"/>
+      <w:pgMar w:top="1701" w:right="1134" w:bottom="1361" w:left="1701" w:header="567" w:footer="0" w:gutter="0"/>
       <w:pgNumType/>
       <w:docGrid w:linePitch="360"/>
     </w:sectPr>
@@ -919,58 +919,13 @@
 <w:ftr xmlns:wpc="http://schemas.microsoft.com/office/word/2010/wordprocessingCanvas" xmlns:mc="http://schemas.openxmlformats.org/markup-compatibility/2006" xmlns:o="urn:schemas-microsoft-com:office:office" xmlns:r="http://schemas.openxmlformats.org/officeDocument/2006/relationships" xmlns:m="http://schemas.openxmlformats.org/officeDocument/2006/math" xmlns:v="urn:schemas-microsoft-com:vml" xmlns:wp14="http://schemas.microsoft.com/office/word/2010/wordprocessingDrawing" xmlns:wp="http://schemas.openxmlformats.org/drawingml/2006/wordprocessingDrawing" xmlns:w10="urn:schemas-microsoft-com:office:word" xmlns:w="http://schemas.openxmlformats.org/wordprocessingml/2006/main" xmlns:w14="http://schemas.microsoft.com/office/word/2010/wordml" xmlns:w15="http://schemas.microsoft.com/office/word/2012/wordml" xmlns:wpg="http://schemas.microsoft.com/office/word/2010/wordprocessingGroup" xmlns:wpi="http://schemas.microsoft.com/office/word/2010/wordprocessingInk" xmlns:wne="http://schemas.microsoft.com/office/word/2006/wordml" xmlns:wps="http://schemas.microsoft.com/office/word/2010/wordprocessingShape">
   <w:p>
     <w:pPr>
-      <w:spacing w:after="0" w:line="240" w:lineRule="auto"/>
+      <w:spacing w:before="0" w:after="0" w:line="240" w:lineRule="auto"/>
       <w:jc w:val="center"/>
     </w:pPr>
     <w:r>
-      <w:drawing>
-        <wp:anchor distT="0" distB="0" distL="0" distR="0" simplePos="0" relativeHeight="0" behindDoc="1" locked="1" layoutInCell="1" allowOverlap="1">
-          <wp:simplePos x="0" y="0"/>
-          <wp:positionH relativeFrom="page">
-            <wp:posOffset>0</wp:posOffset>
-          </wp:positionH>
-          <wp:positionV relativeFrom="page">
-            <wp:posOffset>9936130</wp:posOffset>
-          </wp:positionV>
-          <wp:extent cx="7560000" cy="756000"/>
-          <wp:effectExtent l="0" t="0" r="0" b="0"/>
-          <wp:wrapNone/>
-          <wp:docPr id="1002" name="Faixa do rodapé" descr="Figueiredo Lima Advocacia"/>
-          <wp:cNvGraphicFramePr>
-            <a:graphicFrameLocks xmlns:a="http://schemas.openxmlformats.org/drawingml/2006/main" noChangeAspect="1"/>
-          </wp:cNvGraphicFramePr>
-          <a:graphic xmlns:a="http://schemas.openxmlformats.org/drawingml/2006/main">
-            <a:graphicData uri="http://schemas.openxmlformats.org/drawingml/2006/picture">
-              <pic:pic xmlns:pic="http://schemas.openxmlformats.org/drawingml/2006/picture">
-                <pic:nvPicPr>
-                  <pic:cNvPr id="1002" name="Faixa do rodapé.png"/>
-                  <pic:cNvPicPr/>
-                </pic:nvPicPr>
-                <pic:blipFill>
-                  <a:blip r:embed="rIdFaixaRod"/>
-                  <a:stretch>
-                    <a:fillRect/>
-                  </a:stretch>
-                </pic:blipFill>
-                <pic:spPr>
-                  <a:xfrm>
-                    <a:off x="0" y="0"/>
-                    <a:ext cx="7560000" cy="756000"/>
-                  </a:xfrm>
-                  <a:prstGeom prst="rect">
-                    <a:avLst/>
-                  </a:prstGeom>
-                </pic:spPr>
-              </pic:pic>
-            </a:graphicData>
-          </a:graphic>
-        </wp:anchor>
-      </w:drawing>
-    </w:r>
-    <w:r>
       <w:rPr>
         <w:rFonts w:ascii="Garamond" w:cs="Garamond" w:eastAsia="Garamond" w:hAnsi="Garamond"/>
-        <w:color w:val="C9A54A"/>
+        <w:color w:val="7A5D10"/>
         <w:sz w:val="16"/>
         <w:szCs w:val="16"/>
       </w:rPr>
@@ -979,13 +934,13 @@
   </w:p>
   <w:p>
     <w:pPr>
-      <w:spacing w:after="0" w:line="240" w:lineRule="auto"/>
+      <w:spacing w:before="0" w:after="0" w:line="240" w:lineRule="auto"/>
       <w:jc w:val="center"/>
     </w:pPr>
     <w:r>
       <w:rPr>
         <w:rFonts w:ascii="Garamond" w:cs="Garamond" w:eastAsia="Garamond" w:hAnsi="Garamond"/>
-        <w:color w:val="C9A54A"/>
+        <w:color w:val="7A5D10"/>
         <w:sz w:val="16"/>
         <w:szCs w:val="16"/>
       </w:rPr>
@@ -994,13 +949,13 @@
   </w:p>
   <w:p>
     <w:pPr>
-      <w:spacing w:after="0" w:line="240" w:lineRule="auto"/>
+      <w:spacing w:before="0" w:after="350" w:line="240" w:lineRule="auto"/>
       <w:jc w:val="center"/>
     </w:pPr>
     <w:r>
       <w:rPr>
         <w:rFonts w:ascii="Garamond" w:cs="Garamond" w:eastAsia="Garamond" w:hAnsi="Garamond"/>
-        <w:color w:val="C9A54A"/>
+        <w:color w:val="7A5D10"/>
         <w:sz w:val="16"/>
         <w:szCs w:val="16"/>
       </w:rPr>
@@ -1098,6 +1053,51 @@
         </wp:anchor>
       </w:drawing>
     </w:r>
+    <w:r>
+      <w:drawing>
+        <wp:anchor distT="0" distB="0" distL="0" distR="0" simplePos="0" relativeHeight="0" behindDoc="1" locked="1" layoutInCell="1" allowOverlap="1">
+          <wp:simplePos x="0" y="0"/>
+          <wp:positionH relativeFrom="page">
+            <wp:posOffset>0</wp:posOffset>
+          </wp:positionH>
+          <wp:positionV relativeFrom="page">
+            <wp:posOffset>9936130</wp:posOffset>
+          </wp:positionV>
+          <wp:extent cx="7560000" cy="756000"/>
+          <wp:effectExtent l="0" t="0" r="0" b="0"/>
+          <wp:wrapNone/>
+          <wp:docPr id="1002" name="Faixa do rodapé" descr="Figueiredo Lima Advocacia"/>
+          <wp:cNvGraphicFramePr>
+            <a:graphicFrameLocks xmlns:a="http://schemas.openxmlformats.org/drawingml/2006/main" noChangeAspect="1"/>
+          </wp:cNvGraphicFramePr>
+          <a:graphic xmlns:a="http://schemas.openxmlformats.org/drawingml/2006/main">
+            <a:graphicData uri="http://schemas.openxmlformats.org/drawingml/2006/picture">
+              <pic:pic xmlns:pic="http://schemas.openxmlformats.org/drawingml/2006/picture">
+                <pic:nvPicPr>
+                  <pic:cNvPr id="1002" name="Faixa do rodapé.png"/>
+                  <pic:cNvPicPr/>
+                </pic:nvPicPr>
+                <pic:blipFill>
+                  <a:blip r:embed="rIdFaixaRod"/>
+                  <a:stretch>
+                    <a:fillRect/>
+                  </a:stretch>
+                </pic:blipFill>
+                <pic:spPr>
+                  <a:xfrm>
+                    <a:off x="0" y="0"/>
+                    <a:ext cx="7560000" cy="756000"/>
+                  </a:xfrm>
+                  <a:prstGeom prst="rect">
+                    <a:avLst/>
+                  </a:prstGeom>
+                </pic:spPr>
+              </pic:pic>
+            </a:graphicData>
+          </a:graphic>
+        </wp:anchor>
+      </w:drawing>
+    </w:r>
   </w:p>
 </w:hdr>
 </file>

</xml_diff>

<commit_message>
Logotipo das peças em alta resolução: versão vetorial e imagem própria no cabeçalho
O logotipo saía pixelado no zoom do PDF porque estava dentro da faixa de 21 cm, que o Google Docs
reduz para cerca de 2.000 px. Agora ele é vetorizado (SVG, sem mudar o desenho) e entra no cabeçalho
como imagem própria de 2.000 px em 5 cm, com o SVG para o Word.

Co-Authored-By: Claude Opus 5.5 <noreply@anthropic.com>
</commit_message>
<xml_diff>
--- a/identidade/modelo-peticao-figueiredo-lima.docx
+++ b/identidade/modelo-peticao-figueiredo-lima.docx
@@ -1058,6 +1058,57 @@
         <wp:anchor distT="0" distB="0" distL="0" distR="0" simplePos="0" relativeHeight="0" behindDoc="1" locked="1" layoutInCell="1" allowOverlap="1">
           <wp:simplePos x="0" y="0"/>
           <wp:positionH relativeFrom="page">
+            <wp:posOffset>2870820</wp:posOffset>
+          </wp:positionH>
+          <wp:positionV relativeFrom="page">
+            <wp:posOffset>292680</wp:posOffset>
+          </wp:positionV>
+          <wp:extent cx="1818360" cy="308881"/>
+          <wp:effectExtent l="0" t="0" r="0" b="0"/>
+          <wp:wrapNone/>
+          <wp:docPr id="1003" name="Logotipo" descr="Figueiredo Lima Advocacia"/>
+          <wp:cNvGraphicFramePr>
+            <a:graphicFrameLocks xmlns:a="http://schemas.openxmlformats.org/drawingml/2006/main" noChangeAspect="1"/>
+          </wp:cNvGraphicFramePr>
+          <a:graphic xmlns:a="http://schemas.openxmlformats.org/drawingml/2006/main">
+            <a:graphicData uri="http://schemas.openxmlformats.org/drawingml/2006/picture">
+              <pic:pic xmlns:pic="http://schemas.openxmlformats.org/drawingml/2006/picture">
+                <pic:nvPicPr>
+                  <pic:cNvPr id="1003" name="Logotipo.png"/>
+                  <pic:cNvPicPr/>
+                </pic:nvPicPr>
+                <pic:blipFill>
+                  <a:blip r:embed="rIdLogo">
+                    <a:extLst>
+                      <a:ext uri="{96DAC541-7B7A-43D3-8B79-37D633B846F1}">
+                        <asvg:svgBlip xmlns:asvg="http://schemas.microsoft.com/office/drawing/2016/SVG/main" r:embed="rIdLogoSvg"/>
+                      </a:ext>
+                    </a:extLst>
+                  </a:blip>
+                  <a:stretch>
+                    <a:fillRect/>
+                  </a:stretch>
+                </pic:blipFill>
+                <pic:spPr>
+                  <a:xfrm>
+                    <a:off x="0" y="0"/>
+                    <a:ext cx="1818360" cy="308881"/>
+                  </a:xfrm>
+                  <a:prstGeom prst="rect">
+                    <a:avLst/>
+                  </a:prstGeom>
+                </pic:spPr>
+              </pic:pic>
+            </a:graphicData>
+          </a:graphic>
+        </wp:anchor>
+      </w:drawing>
+    </w:r>
+    <w:r>
+      <w:drawing>
+        <wp:anchor distT="0" distB="0" distL="0" distR="0" simplePos="0" relativeHeight="0" behindDoc="1" locked="1" layoutInCell="1" allowOverlap="1">
+          <wp:simplePos x="0" y="0"/>
+          <wp:positionH relativeFrom="page">
             <wp:posOffset>0</wp:posOffset>
           </wp:positionH>
           <wp:positionV relativeFrom="page">

</xml_diff>